<commit_message>
Replace en dashes across site assets
</commit_message>
<xml_diff>
--- a/docs/go3-sdg-referenzrahmen-v1/source/word/01_woek_sdgs_agenda2030_referenzrahmen_detailkonzept_v1_0.docx
+++ b/docs/go3-sdg-referenzrahmen-v1/source/word/01_woek_sdgs_agenda2030_referenzrahmen_detailkonzept_v1_0.docx
@@ -927,7 +927,7 @@
         <w:pStyle w:val="ListNumber"/>
       </w:pPr>
       <w:r>
-        <w:t>Was die SDGs leisten – und was nicht</w:t>
+        <w:t>Was die SDGs leisten - und was nicht</w:t>
       </w:r>
     </w:p>
     <w:p>
@@ -1478,7 +1478,7 @@
         <w:pStyle w:val="Heading1"/>
       </w:pPr>
       <w:r>
-        <w:t>4. Was die SDGs leisten – und was nicht</w:t>
+        <w:t>4. Was die SDGs leisten - und was nicht</w:t>
       </w:r>
     </w:p>
     <w:p>
@@ -4841,7 +4841,7 @@
                 <w:color w:val="252A2C"/>
                 <w:sz w:val="15"/>
               </w:rPr>
-              <w:t>Sustainable development goals – EU monitoring and data</w:t>
+              <w:t>Sustainable development goals - EU monitoring and data</w:t>
             </w:r>
           </w:p>
         </w:tc>
@@ -4924,7 +4924,7 @@
                 <w:color w:val="252A2C"/>
                 <w:sz w:val="15"/>
               </w:rPr>
-              <w:t>Sustainable development in the European Union – 2025 monitoring report</w:t>
+              <w:t>Sustainable development in the European Union - 2025 monitoring report</w:t>
             </w:r>
           </w:p>
         </w:tc>

</xml_diff>

<commit_message>
Restore accepted site state after bad deployment
</commit_message>
<xml_diff>
--- a/docs/go3-sdg-referenzrahmen-v1/source/word/01_woek_sdgs_agenda2030_referenzrahmen_detailkonzept_v1_0.docx
+++ b/docs/go3-sdg-referenzrahmen-v1/source/word/01_woek_sdgs_agenda2030_referenzrahmen_detailkonzept_v1_0.docx
@@ -927,7 +927,7 @@
         <w:pStyle w:val="ListNumber"/>
       </w:pPr>
       <w:r>
-        <w:t>Was die SDGs leisten – und was nicht</w:t>
+        <w:t>Was die SDGs leisten - und was nicht</w:t>
       </w:r>
     </w:p>
     <w:p>
@@ -1478,7 +1478,7 @@
         <w:pStyle w:val="Heading1"/>
       </w:pPr>
       <w:r>
-        <w:t>4. Was die SDGs leisten – und was nicht</w:t>
+        <w:t>4. Was die SDGs leisten - und was nicht</w:t>
       </w:r>
     </w:p>
     <w:p>
@@ -4841,7 +4841,7 @@
                 <w:color w:val="252A2C"/>
                 <w:sz w:val="15"/>
               </w:rPr>
-              <w:t>Sustainable development goals – EU monitoring and data</w:t>
+              <w:t>Sustainable development goals - EU monitoring and data</w:t>
             </w:r>
           </w:p>
         </w:tc>
@@ -4924,7 +4924,7 @@
                 <w:color w:val="252A2C"/>
                 <w:sz w:val="15"/>
               </w:rPr>
-              <w:t>Sustainable development in the European Union – 2025 monitoring report</w:t>
+              <w:t>Sustainable development in the European Union - 2025 monitoring report</w:t>
             </w:r>
           </w:p>
         </w:tc>

</xml_diff>